<commit_message>
Fill work-time safety instruction clauses
</commit_message>
<xml_diff>
--- a/instructions_docx/ИОТ-ВИД-01.docx
+++ b/instructions_docx/ИОТ-ВИД-01.docx
@@ -737,20 +737,14 @@
     <w:p>
       <w:pPr>
         <w:widowControl/>
+        <w:spacing w:after="60"/>
       </w:pPr>
-      <w:r>
-        <w:rPr>
-          <w:rFonts w:ascii="Times New Roman" w:hAnsi="Times New Roman" w:eastAsia="Times New Roman"/>
-          <w:sz w:val="24"/>
-        </w:rPr>
-        <w:t xml:space="preserve">[[[вставить пункты с тегами </w:t>
-      </w:r>
       <w:r>
         <w:rPr>
           <w:rFonts w:ascii="Times New Roman" w:hAnsi="Times New Roman" w:eastAsia="Times New Roman"/>
           <w:b/>
           <w:color w:val="965A00"/>
-          <w:sz w:val="20"/>
+          <w:sz w:val="24"/>
           <w:highlight w:val="yellow"/>
         </w:rPr>
         <w:t>[{[ВОВРЕМЯ-01]}]</w:t>
@@ -760,14 +754,135 @@
           <w:rFonts w:ascii="Times New Roman" w:hAnsi="Times New Roman" w:eastAsia="Times New Roman"/>
           <w:sz w:val="24"/>
         </w:rPr>
-        <w:t xml:space="preserve"> - </w:t>
+        <w:t xml:space="preserve"> 3.1. Выполнять только ту работу, которая входит в должностные обязанности или поручена непосредственным руководителем, при условии, что безопасные способы её выполнения известны.</w:t>
       </w:r>
+    </w:p>
+    <w:p>
+      <w:pPr>
+        <w:widowControl/>
+        <w:spacing w:after="60"/>
+      </w:pPr>
       <w:r>
         <w:rPr>
           <w:rFonts w:ascii="Times New Roman" w:hAnsi="Times New Roman" w:eastAsia="Times New Roman"/>
           <w:b/>
           <w:color w:val="965A00"/>
-          <w:sz w:val="20"/>
+          <w:sz w:val="24"/>
+          <w:highlight w:val="yellow"/>
+        </w:rPr>
+        <w:t>[{[ВОВРЕМЯ-02]}]</w:t>
+      </w:r>
+      <w:r>
+        <w:rPr>
+          <w:rFonts w:ascii="Times New Roman" w:hAnsi="Times New Roman" w:eastAsia="Times New Roman"/>
+          <w:sz w:val="24"/>
+        </w:rPr>
+        <w:t xml:space="preserve"> 3.2. При выполнении работы быть внимательным, не отвлекаться и не отвлекать других работников.</w:t>
+      </w:r>
+    </w:p>
+    <w:p>
+      <w:pPr>
+        <w:widowControl/>
+        <w:spacing w:after="60"/>
+      </w:pPr>
+      <w:r>
+        <w:rPr>
+          <w:rFonts w:ascii="Times New Roman" w:hAnsi="Times New Roman" w:eastAsia="Times New Roman"/>
+          <w:b/>
+          <w:color w:val="965A00"/>
+          <w:sz w:val="24"/>
+          <w:highlight w:val="yellow"/>
+        </w:rPr>
+        <w:t>[{[ВОВРЕМЯ-03]}]</w:t>
+      </w:r>
+      <w:r>
+        <w:rPr>
+          <w:rFonts w:ascii="Times New Roman" w:hAnsi="Times New Roman" w:eastAsia="Times New Roman"/>
+          <w:sz w:val="24"/>
+        </w:rPr>
+        <w:t xml:space="preserve"> 3.3. Применять исправные оборудование, инструмент, приспособления, использовать их только по прямому назначению.</w:t>
+      </w:r>
+    </w:p>
+    <w:p>
+      <w:pPr>
+        <w:widowControl/>
+        <w:spacing w:after="60"/>
+      </w:pPr>
+      <w:r>
+        <w:rPr>
+          <w:rFonts w:ascii="Times New Roman" w:hAnsi="Times New Roman" w:eastAsia="Times New Roman"/>
+          <w:b/>
+          <w:color w:val="965A00"/>
+          <w:sz w:val="24"/>
+          <w:highlight w:val="yellow"/>
+        </w:rPr>
+        <w:t>[{[ВОВРЕМЯ-04]}]</w:t>
+      </w:r>
+      <w:r>
+        <w:rPr>
+          <w:rFonts w:ascii="Times New Roman" w:hAnsi="Times New Roman" w:eastAsia="Times New Roman"/>
+          <w:sz w:val="24"/>
+        </w:rPr>
+        <w:t xml:space="preserve"> 3.4. Во время проведения работ пользоваться и правильно применять выданные СИЗ. Работать только в исправной спецодежде и спецобуви.</w:t>
+      </w:r>
+    </w:p>
+    <w:p>
+      <w:pPr>
+        <w:widowControl/>
+        <w:spacing w:after="60"/>
+      </w:pPr>
+      <w:r>
+        <w:rPr>
+          <w:rFonts w:ascii="Times New Roman" w:hAnsi="Times New Roman" w:eastAsia="Times New Roman"/>
+          <w:b/>
+          <w:color w:val="965A00"/>
+          <w:sz w:val="24"/>
+          <w:highlight w:val="yellow"/>
+        </w:rPr>
+        <w:t>[{[ВОВРЕМЯ-05]}]</w:t>
+      </w:r>
+      <w:r>
+        <w:rPr>
+          <w:rFonts w:ascii="Times New Roman" w:hAnsi="Times New Roman" w:eastAsia="Times New Roman"/>
+          <w:sz w:val="24"/>
+        </w:rPr>
+        <w:t xml:space="preserve"> 3.5. Поддерживать чистоту и порядок на рабочем месте, не допускать загромождения деталями, материалами, инструментом, приспособлениями.</w:t>
+      </w:r>
+    </w:p>
+    <w:p>
+      <w:pPr>
+        <w:widowControl/>
+        <w:spacing w:after="60"/>
+      </w:pPr>
+      <w:r>
+        <w:rPr>
+          <w:rFonts w:ascii="Times New Roman" w:hAnsi="Times New Roman" w:eastAsia="Times New Roman"/>
+          <w:b/>
+          <w:color w:val="965A00"/>
+          <w:sz w:val="24"/>
+          <w:highlight w:val="yellow"/>
+        </w:rPr>
+        <w:t>[{[ВОВРЕМЯ-06]}]</w:t>
+      </w:r>
+      <w:r>
+        <w:rPr>
+          <w:rFonts w:ascii="Times New Roman" w:hAnsi="Times New Roman" w:eastAsia="Times New Roman"/>
+          <w:sz w:val="24"/>
+        </w:rPr>
+        <w:t xml:space="preserve"> 3.6. Не курить, не принимать пищу на рабочем месте.</w:t>
+      </w:r>
+    </w:p>
+    <w:p>
+      <w:pPr>
+        <w:widowControl/>
+        <w:spacing w:after="60"/>
+      </w:pPr>
+      <w:r>
+        <w:rPr>
+          <w:rFonts w:ascii="Times New Roman" w:hAnsi="Times New Roman" w:eastAsia="Times New Roman"/>
+          <w:b/>
+          <w:color w:val="965A00"/>
+          <w:sz w:val="24"/>
           <w:highlight w:val="yellow"/>
         </w:rPr>
         <w:t>[{[ВОВРЕМЯ-07]}]</w:t>
@@ -777,7 +892,7 @@
           <w:rFonts w:ascii="Times New Roman" w:hAnsi="Times New Roman" w:eastAsia="Times New Roman"/>
           <w:sz w:val="24"/>
         </w:rPr>
-        <w:t xml:space="preserve"> из ИОТ-СПС-01]]]</w:t>
+        <w:t xml:space="preserve"> 3.7. Соблюдать правила перемещения в помещении и на территории организации, пользоваться только установленными проходами.</w:t>
       </w:r>
     </w:p>
     <w:p>

</xml_diff>

<commit_message>
Complete occupational safety instruction documents
</commit_message>
<xml_diff>
--- a/instructions_docx/ИОТ-ВИД-01.docx
+++ b/instructions_docx/ИОТ-ВИД-01.docx
@@ -265,20 +265,14 @@
     <w:p>
       <w:pPr>
         <w:widowControl/>
+        <w:spacing w:after="60"/>
       </w:pPr>
-      <w:r>
-        <w:rPr>
-          <w:rFonts w:ascii="Times New Roman" w:hAnsi="Times New Roman" w:eastAsia="Times New Roman"/>
-          <w:sz w:val="24"/>
-        </w:rPr>
-        <w:t xml:space="preserve">[[[вставить пункты с тегами </w:t>
-      </w:r>
       <w:r>
         <w:rPr>
           <w:rFonts w:ascii="Times New Roman" w:hAnsi="Times New Roman" w:eastAsia="Times New Roman"/>
           <w:b/>
           <w:color w:val="965A00"/>
-          <w:sz w:val="20"/>
+          <w:sz w:val="24"/>
           <w:highlight w:val="yellow"/>
         </w:rPr>
         <w:t>[{[ОБЩ-01]}]</w:t>
@@ -288,14 +282,181 @@
           <w:rFonts w:ascii="Times New Roman" w:hAnsi="Times New Roman" w:eastAsia="Times New Roman"/>
           <w:sz w:val="24"/>
         </w:rPr>
-        <w:t xml:space="preserve"> - </w:t>
+        <w:t xml:space="preserve"> 1.1. Настоящая инструкция устанавливает требования по обеспечению безопасных условий труда для начальника садово-парковой службы ООО «Слайс ЛТД».</w:t>
       </w:r>
+    </w:p>
+    <w:p>
+      <w:pPr>
+        <w:widowControl/>
+        <w:spacing w:after="60"/>
+      </w:pPr>
       <w:r>
         <w:rPr>
           <w:rFonts w:ascii="Times New Roman" w:hAnsi="Times New Roman" w:eastAsia="Times New Roman"/>
           <w:b/>
           <w:color w:val="965A00"/>
-          <w:sz w:val="20"/>
+          <w:sz w:val="24"/>
+          <w:highlight w:val="yellow"/>
+        </w:rPr>
+        <w:t>[{[ОБЩ-02]}]</w:t>
+      </w:r>
+      <w:r>
+        <w:rPr>
+          <w:rFonts w:ascii="Times New Roman" w:hAnsi="Times New Roman" w:eastAsia="Times New Roman"/>
+          <w:sz w:val="24"/>
+        </w:rPr>
+        <w:t xml:space="preserve"> 1.2. Настоящая инструкция по охране труда разработана на основе установленных обязательных требований по охране труда в Российской Федерации, а также:</w:t>
+      </w:r>
+    </w:p>
+    <w:p>
+      <w:pPr>
+        <w:widowControl/>
+        <w:spacing w:after="60"/>
+      </w:pPr>
+      <w:r>
+        <w:rPr>
+          <w:rFonts w:ascii="Times New Roman" w:hAnsi="Times New Roman" w:eastAsia="Times New Roman"/>
+          <w:b/>
+          <w:color w:val="965A00"/>
+          <w:sz w:val="24"/>
+          <w:highlight w:val="yellow"/>
+        </w:rPr>
+        <w:t>[{[ОБЩ-03]}]</w:t>
+      </w:r>
+      <w:r>
+        <w:rPr>
+          <w:rFonts w:ascii="Times New Roman" w:hAnsi="Times New Roman" w:eastAsia="Times New Roman"/>
+          <w:sz w:val="24"/>
+        </w:rPr>
+        <w:t xml:space="preserve"> 1.3. Выполнение требований настоящей инструкции обязательно для всех работников в должности начальника садово-парковой службы ООО «Слайс ЛТД» при выполнении ими трудовых обязанностей независимо от квалификации и стажа работы.</w:t>
+      </w:r>
+    </w:p>
+    <w:p>
+      <w:pPr>
+        <w:widowControl/>
+        <w:spacing w:after="60"/>
+      </w:pPr>
+      <w:r>
+        <w:rPr>
+          <w:rFonts w:ascii="Times New Roman" w:hAnsi="Times New Roman" w:eastAsia="Times New Roman"/>
+          <w:b/>
+          <w:color w:val="965A00"/>
+          <w:sz w:val="24"/>
+          <w:highlight w:val="yellow"/>
+        </w:rPr>
+        <w:t>[{[ОБЩ-04]}]</w:t>
+      </w:r>
+      <w:r>
+        <w:rPr>
+          <w:rFonts w:ascii="Times New Roman" w:hAnsi="Times New Roman" w:eastAsia="Times New Roman"/>
+          <w:sz w:val="24"/>
+        </w:rPr>
+        <w:t xml:space="preserve"> 1.4. К самостоятельной работе в должности начальника садово-парковой службы допускаются лица не моложе 18 лет, прошедшие:</w:t>
+      </w:r>
+    </w:p>
+    <w:p>
+      <w:pPr>
+        <w:widowControl/>
+        <w:spacing w:after="60"/>
+      </w:pPr>
+      <w:r>
+        <w:rPr>
+          <w:rFonts w:ascii="Times New Roman" w:hAnsi="Times New Roman" w:eastAsia="Times New Roman"/>
+          <w:b/>
+          <w:color w:val="965A00"/>
+          <w:sz w:val="24"/>
+          <w:highlight w:val="yellow"/>
+        </w:rPr>
+        <w:t>[{[ОБЩ-05]}]</w:t>
+      </w:r>
+      <w:r>
+        <w:rPr>
+          <w:rFonts w:ascii="Times New Roman" w:hAnsi="Times New Roman" w:eastAsia="Times New Roman"/>
+          <w:sz w:val="24"/>
+        </w:rPr>
+        <w:t xml:space="preserve"> 1.5. Повторный инструктаж проводится не реже одного раза в 6 месяцев непосредственным руководителем работ.</w:t>
+      </w:r>
+    </w:p>
+    <w:p>
+      <w:pPr>
+        <w:widowControl/>
+        <w:spacing w:after="60"/>
+      </w:pPr>
+      <w:r>
+        <w:rPr>
+          <w:rFonts w:ascii="Times New Roman" w:hAnsi="Times New Roman" w:eastAsia="Times New Roman"/>
+          <w:b/>
+          <w:color w:val="965A00"/>
+          <w:sz w:val="24"/>
+          <w:highlight w:val="yellow"/>
+        </w:rPr>
+        <w:t>[{[ОБЩ-06]}]</w:t>
+      </w:r>
+      <w:r>
+        <w:rPr>
+          <w:rFonts w:ascii="Times New Roman" w:hAnsi="Times New Roman" w:eastAsia="Times New Roman"/>
+          <w:sz w:val="24"/>
+        </w:rPr>
+        <w:t xml:space="preserve"> 1.6. Внеплановый инструктаж проводится при:</w:t>
+      </w:r>
+    </w:p>
+    <w:p>
+      <w:pPr>
+        <w:widowControl/>
+        <w:spacing w:after="60"/>
+      </w:pPr>
+      <w:r>
+        <w:rPr>
+          <w:rFonts w:ascii="Times New Roman" w:hAnsi="Times New Roman" w:eastAsia="Times New Roman"/>
+          <w:b/>
+          <w:color w:val="965A00"/>
+          <w:sz w:val="24"/>
+          <w:highlight w:val="yellow"/>
+        </w:rPr>
+        <w:t>[{[ОБЩ-07]}]</w:t>
+      </w:r>
+      <w:r>
+        <w:rPr>
+          <w:rFonts w:ascii="Times New Roman" w:hAnsi="Times New Roman" w:eastAsia="Times New Roman"/>
+          <w:sz w:val="24"/>
+        </w:rPr>
+        <w:t xml:space="preserve"> 1.7. Целевой инструктаж проводится при:</w:t>
+      </w:r>
+    </w:p>
+    <w:p>
+      <w:pPr>
+        <w:widowControl/>
+        <w:spacing w:after="60"/>
+      </w:pPr>
+      <w:r>
+        <w:rPr>
+          <w:rFonts w:ascii="Times New Roman" w:hAnsi="Times New Roman" w:eastAsia="Times New Roman"/>
+          <w:b/>
+          <w:color w:val="965A00"/>
+          <w:sz w:val="24"/>
+          <w:highlight w:val="yellow"/>
+        </w:rPr>
+        <w:t>[{[ОБЩ-08]}]</w:t>
+      </w:r>
+      <w:r>
+        <w:rPr>
+          <w:rFonts w:ascii="Times New Roman" w:hAnsi="Times New Roman" w:eastAsia="Times New Roman"/>
+          <w:sz w:val="24"/>
+        </w:rPr>
+        <w:t xml:space="preserve"> 1.8. Работник, не прошедший своевременно инструктажи, обучение и проверку знаний требований охраны труда, к самостоятельной работе не допускается.</w:t>
+      </w:r>
+    </w:p>
+    <w:p>
+      <w:pPr>
+        <w:widowControl/>
+        <w:spacing w:after="60"/>
+      </w:pPr>
+      <w:r>
+        <w:rPr>
+          <w:rFonts w:ascii="Times New Roman" w:hAnsi="Times New Roman" w:eastAsia="Times New Roman"/>
+          <w:b/>
+          <w:color w:val="965A00"/>
+          <w:sz w:val="24"/>
           <w:highlight w:val="yellow"/>
         </w:rPr>
         <w:t>[{[ОБЩ-09]}]</w:t>
@@ -305,7 +466,7 @@
           <w:rFonts w:ascii="Times New Roman" w:hAnsi="Times New Roman" w:eastAsia="Times New Roman"/>
           <w:sz w:val="24"/>
         </w:rPr>
-        <w:t xml:space="preserve"> из ИОТ-СПС-01]]]</w:t>
+        <w:t xml:space="preserve"> 1.9. Работнику запрещается пользоваться инструментом, приспособлениями и оборудованием, безопасному обращению с которым он не обучен.</w:t>
       </w:r>
     </w:p>
     <w:p>
@@ -355,20 +516,14 @@
     <w:p>
       <w:pPr>
         <w:widowControl/>
+        <w:spacing w:after="60"/>
       </w:pPr>
-      <w:r>
-        <w:rPr>
-          <w:rFonts w:ascii="Times New Roman" w:hAnsi="Times New Roman" w:eastAsia="Times New Roman"/>
-          <w:sz w:val="24"/>
-        </w:rPr>
-        <w:t xml:space="preserve">[[[вставить пункты с тегами </w:t>
-      </w:r>
       <w:r>
         <w:rPr>
           <w:rFonts w:ascii="Times New Roman" w:hAnsi="Times New Roman" w:eastAsia="Times New Roman"/>
           <w:b/>
           <w:color w:val="965A00"/>
-          <w:sz w:val="20"/>
+          <w:sz w:val="24"/>
           <w:highlight w:val="yellow"/>
         </w:rPr>
         <w:t>[{[ОБЩ-12]}]</w:t>
@@ -378,14 +533,227 @@
           <w:rFonts w:ascii="Times New Roman" w:hAnsi="Times New Roman" w:eastAsia="Times New Roman"/>
           <w:sz w:val="24"/>
         </w:rPr>
-        <w:t xml:space="preserve"> - </w:t>
+        <w:t xml:space="preserve"> 1.12. Выдаваемые СИЗ должны соответствовать характеру и условиям работы, обеспечивать безопасность труда, иметь сертификат или декларацию соответствия. СИЗ, на которые не имеется технической документации, к применению не допускаются.</w:t>
       </w:r>
+    </w:p>
+    <w:p>
+      <w:pPr>
+        <w:widowControl/>
+        <w:spacing w:after="60"/>
+      </w:pPr>
       <w:r>
         <w:rPr>
           <w:rFonts w:ascii="Times New Roman" w:hAnsi="Times New Roman" w:eastAsia="Times New Roman"/>
           <w:b/>
           <w:color w:val="965A00"/>
-          <w:sz w:val="20"/>
+          <w:sz w:val="24"/>
+          <w:highlight w:val="yellow"/>
+        </w:rPr>
+        <w:t>[{[ОБЩ-13]}]</w:t>
+      </w:r>
+      <w:r>
+        <w:rPr>
+          <w:rFonts w:ascii="Times New Roman" w:hAnsi="Times New Roman" w:eastAsia="Times New Roman"/>
+          <w:sz w:val="24"/>
+        </w:rPr>
+        <w:t xml:space="preserve"> 1.13. Личную одежду и спецодежду необходимо хранить отдельно в шкафчиках и гардеробной. Уносить спецодежду за пределы предприятия запрещается.</w:t>
+      </w:r>
+    </w:p>
+    <w:p>
+      <w:pPr>
+        <w:widowControl/>
+        <w:spacing w:after="60"/>
+      </w:pPr>
+      <w:r>
+        <w:rPr>
+          <w:rFonts w:ascii="Times New Roman" w:hAnsi="Times New Roman" w:eastAsia="Times New Roman"/>
+          <w:b/>
+          <w:color w:val="965A00"/>
+          <w:sz w:val="24"/>
+          <w:highlight w:val="yellow"/>
+        </w:rPr>
+        <w:t>[{[ОБЩ-14]}]</w:t>
+      </w:r>
+      <w:r>
+        <w:rPr>
+          <w:rFonts w:ascii="Times New Roman" w:hAnsi="Times New Roman" w:eastAsia="Times New Roman"/>
+          <w:sz w:val="24"/>
+        </w:rPr>
+        <w:t xml:space="preserve"> 1.14. Работник обязан соблюдать действующие в ООО «Слайс ЛТД» Правила внутреннего трудового распорядка и графики работы, которыми предусматриваются: время начала и окончания работы (смены), перерывы для отдыха и питания, порядок предоставления дней отдыха, чередование смен и другие вопросы использования рабочего времени.</w:t>
+      </w:r>
+    </w:p>
+    <w:p>
+      <w:pPr>
+        <w:widowControl/>
+        <w:spacing w:after="60"/>
+      </w:pPr>
+      <w:r>
+        <w:rPr>
+          <w:rFonts w:ascii="Times New Roman" w:hAnsi="Times New Roman" w:eastAsia="Times New Roman"/>
+          <w:b/>
+          <w:color w:val="965A00"/>
+          <w:sz w:val="24"/>
+          <w:highlight w:val="yellow"/>
+        </w:rPr>
+        <w:t>[{[ОБЩ-15]}]</w:t>
+      </w:r>
+      <w:r>
+        <w:rPr>
+          <w:rFonts w:ascii="Times New Roman" w:hAnsi="Times New Roman" w:eastAsia="Times New Roman"/>
+          <w:sz w:val="24"/>
+        </w:rPr>
+        <w:t xml:space="preserve"> 1.15. Продолжительность ежедневной работы, перерывов для отдыха и приёма пищи определяется Правилами внутреннего трудового распорядка ООО «Слайс ЛТД» и трудовым договором.</w:t>
+      </w:r>
+    </w:p>
+    <w:p>
+      <w:pPr>
+        <w:widowControl/>
+        <w:spacing w:after="60"/>
+      </w:pPr>
+      <w:r>
+        <w:rPr>
+          <w:rFonts w:ascii="Times New Roman" w:hAnsi="Times New Roman" w:eastAsia="Times New Roman"/>
+          <w:b/>
+          <w:color w:val="965A00"/>
+          <w:sz w:val="24"/>
+          <w:highlight w:val="yellow"/>
+        </w:rPr>
+        <w:t>[{[ОБЩ-16]}]</w:t>
+      </w:r>
+      <w:r>
+        <w:rPr>
+          <w:rFonts w:ascii="Times New Roman" w:hAnsi="Times New Roman" w:eastAsia="Times New Roman"/>
+          <w:sz w:val="24"/>
+        </w:rPr>
+        <w:t xml:space="preserve"> 1.16. Работник обязан соблюдать режимы труда и отдыха. Работник должен выходить на работу своевременно, отдохнувшим, подготовленным к работе.</w:t>
+      </w:r>
+    </w:p>
+    <w:p>
+      <w:pPr>
+        <w:widowControl/>
+        <w:spacing w:after="60"/>
+      </w:pPr>
+      <w:r>
+        <w:rPr>
+          <w:rFonts w:ascii="Times New Roman" w:hAnsi="Times New Roman" w:eastAsia="Times New Roman"/>
+          <w:b/>
+          <w:color w:val="965A00"/>
+          <w:sz w:val="24"/>
+          <w:highlight w:val="yellow"/>
+        </w:rPr>
+        <w:t>[{[ОБЩ-17]}]</w:t>
+      </w:r>
+      <w:r>
+        <w:rPr>
+          <w:rFonts w:ascii="Times New Roman" w:hAnsi="Times New Roman" w:eastAsia="Times New Roman"/>
+          <w:sz w:val="24"/>
+        </w:rPr>
+        <w:t xml:space="preserve"> 1.17. Работник обязан немедленно извещать своего непосредственного или вышестоящего руководителя о любой ситуации, угрожающей жизни и здоровью людей, о каждом несчастном случае, микротравме, происшедших на производстве, или об ухудшении состояния своего здоровья, в том числе о проявлении признаков острого профессионального заболевания (отравления).</w:t>
+      </w:r>
+    </w:p>
+    <w:p>
+      <w:pPr>
+        <w:widowControl/>
+        <w:spacing w:after="60"/>
+      </w:pPr>
+      <w:r>
+        <w:rPr>
+          <w:rFonts w:ascii="Times New Roman" w:hAnsi="Times New Roman" w:eastAsia="Times New Roman"/>
+          <w:b/>
+          <w:color w:val="965A00"/>
+          <w:sz w:val="24"/>
+          <w:highlight w:val="yellow"/>
+        </w:rPr>
+        <w:t>[{[ОБЩ-18]}]</w:t>
+      </w:r>
+      <w:r>
+        <w:rPr>
+          <w:rFonts w:ascii="Times New Roman" w:hAnsi="Times New Roman" w:eastAsia="Times New Roman"/>
+          <w:sz w:val="24"/>
+        </w:rPr>
+        <w:t xml:space="preserve"> 1.18. При обнаружении в зоне работы несоответствий требованиям охраны труда (неисправность оборудования, приспособлений и инструмента, неогороженный проём, траншея, открытый колодец, отсутствие или неисправность ограждения опасной зоны, оголённые провода и т.д.) немедленно сообщить об этом непосредственному руководителю работ.</w:t>
+      </w:r>
+    </w:p>
+    <w:p>
+      <w:pPr>
+        <w:widowControl/>
+        <w:spacing w:after="60"/>
+      </w:pPr>
+      <w:r>
+        <w:rPr>
+          <w:rFonts w:ascii="Times New Roman" w:hAnsi="Times New Roman" w:eastAsia="Times New Roman"/>
+          <w:b/>
+          <w:color w:val="965A00"/>
+          <w:sz w:val="24"/>
+          <w:highlight w:val="yellow"/>
+        </w:rPr>
+        <w:t>[{[ОБЩ-19]}]</w:t>
+      </w:r>
+      <w:r>
+        <w:rPr>
+          <w:rFonts w:ascii="Times New Roman" w:hAnsi="Times New Roman" w:eastAsia="Times New Roman"/>
+          <w:sz w:val="24"/>
+        </w:rPr>
+        <w:t xml:space="preserve"> 1.19. Работник обязан соблюдать правила личной гигиены:</w:t>
+      </w:r>
+    </w:p>
+    <w:p>
+      <w:pPr>
+        <w:widowControl/>
+        <w:spacing w:after="60"/>
+      </w:pPr>
+      <w:r>
+        <w:rPr>
+          <w:rFonts w:ascii="Times New Roman" w:hAnsi="Times New Roman" w:eastAsia="Times New Roman"/>
+          <w:b/>
+          <w:color w:val="965A00"/>
+          <w:sz w:val="24"/>
+          <w:highlight w:val="yellow"/>
+        </w:rPr>
+        <w:t>[{[ОБЩ-20]}]</w:t>
+      </w:r>
+      <w:r>
+        <w:rPr>
+          <w:rFonts w:ascii="Times New Roman" w:hAnsi="Times New Roman" w:eastAsia="Times New Roman"/>
+          <w:sz w:val="24"/>
+        </w:rPr>
+        <w:t xml:space="preserve"> 1.20. Для предупреждения возможности возникновения пожара работник обязан соблюдать требования пожарной безопасности и не допускать нарушения этих требований другими работниками.</w:t>
+      </w:r>
+    </w:p>
+    <w:p>
+      <w:pPr>
+        <w:widowControl/>
+        <w:spacing w:after="60"/>
+      </w:pPr>
+      <w:r>
+        <w:rPr>
+          <w:rFonts w:ascii="Times New Roman" w:hAnsi="Times New Roman" w:eastAsia="Times New Roman"/>
+          <w:b/>
+          <w:color w:val="965A00"/>
+          <w:sz w:val="24"/>
+          <w:highlight w:val="yellow"/>
+        </w:rPr>
+        <w:t>[{[ОБЩ-21]}]</w:t>
+      </w:r>
+      <w:r>
+        <w:rPr>
+          <w:rFonts w:ascii="Times New Roman" w:hAnsi="Times New Roman" w:eastAsia="Times New Roman"/>
+          <w:sz w:val="24"/>
+        </w:rPr>
+        <w:t xml:space="preserve"> 1.21. Работник, допустивший нарушение или невыполнение требований инструкции по охране труда, рассматривается как нарушитель производственной дисциплины и может быть привлечён к дисциплинарной ответственности, а в зависимости от последствий – к уголовной; если нарушение связано с причинением материального ущерба, виновный может привлекаться к материальной ответственности в установленном порядке.</w:t>
+      </w:r>
+    </w:p>
+    <w:p>
+      <w:pPr>
+        <w:widowControl/>
+        <w:spacing w:after="60"/>
+      </w:pPr>
+      <w:r>
+        <w:rPr>
+          <w:rFonts w:ascii="Times New Roman" w:hAnsi="Times New Roman" w:eastAsia="Times New Roman"/>
+          <w:b/>
+          <w:color w:val="965A00"/>
+          <w:sz w:val="24"/>
           <w:highlight w:val="yellow"/>
         </w:rPr>
         <w:t>[{[ОБЩ-22]}]</w:t>
@@ -395,7 +763,7 @@
           <w:rFonts w:ascii="Times New Roman" w:hAnsi="Times New Roman" w:eastAsia="Times New Roman"/>
           <w:sz w:val="24"/>
         </w:rPr>
-        <w:t xml:space="preserve"> из ИОТ-СПС-01]]]</w:t>
+        <w:t xml:space="preserve"> 1.22. Для осуществления контроля за соблюдением требований данной инструкции администрация может осуществлять видео- и фотофиксацию нарушений требований охраны труда.</w:t>
       </w:r>
     </w:p>
     <w:p>
@@ -502,20 +870,14 @@
     <w:p>
       <w:pPr>
         <w:widowControl/>
+        <w:spacing w:after="60"/>
       </w:pPr>
-      <w:r>
-        <w:rPr>
-          <w:rFonts w:ascii="Times New Roman" w:hAnsi="Times New Roman" w:eastAsia="Times New Roman"/>
-          <w:sz w:val="24"/>
-        </w:rPr>
-        <w:t xml:space="preserve">[[[вставить пункты с тегами </w:t>
-      </w:r>
       <w:r>
         <w:rPr>
           <w:rFonts w:ascii="Times New Roman" w:hAnsi="Times New Roman" w:eastAsia="Times New Roman"/>
           <w:b/>
           <w:color w:val="965A00"/>
-          <w:sz w:val="20"/>
+          <w:sz w:val="24"/>
           <w:highlight w:val="yellow"/>
         </w:rPr>
         <w:t>[{[ПЕРЕД-01]}]</w:t>
@@ -525,14 +887,66 @@
           <w:rFonts w:ascii="Times New Roman" w:hAnsi="Times New Roman" w:eastAsia="Times New Roman"/>
           <w:sz w:val="24"/>
         </w:rPr>
-        <w:t xml:space="preserve"> - </w:t>
+        <w:t xml:space="preserve"> 2.1. Надеть исправную спецодежду, спецобувь и положенные СИЗ, предварительно проверив их исправность. При нарушении целостности спецодежды, спецобуви и СИЗ сообщить об этом непосредственному руководителю.</w:t>
       </w:r>
+    </w:p>
+    <w:p>
+      <w:pPr>
+        <w:widowControl/>
+        <w:spacing w:after="60"/>
+      </w:pPr>
       <w:r>
         <w:rPr>
           <w:rFonts w:ascii="Times New Roman" w:hAnsi="Times New Roman" w:eastAsia="Times New Roman"/>
           <w:b/>
           <w:color w:val="965A00"/>
-          <w:sz w:val="20"/>
+          <w:sz w:val="24"/>
+          <w:highlight w:val="yellow"/>
+        </w:rPr>
+        <w:t>[{[ПЕРЕД-02]}]</w:t>
+      </w:r>
+      <w:r>
+        <w:rPr>
+          <w:rFonts w:ascii="Times New Roman" w:hAnsi="Times New Roman" w:eastAsia="Times New Roman"/>
+          <w:sz w:val="24"/>
+        </w:rPr>
+        <w:t xml:space="preserve"> 2.2. Определить своё психофизиологическое состояние. При недомогании известить об этом руководителя и обратиться за медицинской помощью.</w:t>
+      </w:r>
+    </w:p>
+    <w:p>
+      <w:pPr>
+        <w:widowControl/>
+        <w:spacing w:after="60"/>
+      </w:pPr>
+      <w:r>
+        <w:rPr>
+          <w:rFonts w:ascii="Times New Roman" w:hAnsi="Times New Roman" w:eastAsia="Times New Roman"/>
+          <w:b/>
+          <w:color w:val="965A00"/>
+          <w:sz w:val="24"/>
+          <w:highlight w:val="yellow"/>
+        </w:rPr>
+        <w:t>[{[ПЕРЕД-03]}]</w:t>
+      </w:r>
+      <w:r>
+        <w:rPr>
+          <w:rFonts w:ascii="Times New Roman" w:hAnsi="Times New Roman" w:eastAsia="Times New Roman"/>
+          <w:sz w:val="24"/>
+        </w:rPr>
+        <w:t xml:space="preserve"> 2.3. Получить от непосредственного руководителя задание на смену с указанием мер безопасности для выполнения задания.</w:t>
+      </w:r>
+    </w:p>
+    <w:p>
+      <w:pPr>
+        <w:widowControl/>
+        <w:spacing w:after="60"/>
+      </w:pPr>
+      <w:r>
+        <w:rPr>
+          <w:rFonts w:ascii="Times New Roman" w:hAnsi="Times New Roman" w:eastAsia="Times New Roman"/>
+          <w:b/>
+          <w:color w:val="965A00"/>
+          <w:sz w:val="24"/>
           <w:highlight w:val="yellow"/>
         </w:rPr>
         <w:t>[{[ПЕРЕД-04]}]</w:t>
@@ -542,7 +956,7 @@
           <w:rFonts w:ascii="Times New Roman" w:hAnsi="Times New Roman" w:eastAsia="Times New Roman"/>
           <w:sz w:val="24"/>
         </w:rPr>
-        <w:t xml:space="preserve"> из ИОТ-СПС-01]]]</w:t>
+        <w:t xml:space="preserve"> 2.4. Оценить свою теоретическую и практическую подготовку применительно к намечаемой работе. Определить источники опасности и риски. В случае незнания способов безопасного выполнения работы, а также при отсутствии необходимых СИЗ, приспособлений или инструмента – обратиться к непосредственному руководителю.</w:t>
       </w:r>
     </w:p>
     <w:p>
@@ -678,20 +1092,14 @@
     <w:p>
       <w:pPr>
         <w:widowControl/>
+        <w:spacing w:after="60"/>
       </w:pPr>
-      <w:r>
-        <w:rPr>
-          <w:rFonts w:ascii="Times New Roman" w:hAnsi="Times New Roman" w:eastAsia="Times New Roman"/>
-          <w:sz w:val="24"/>
-        </w:rPr>
-        <w:t xml:space="preserve">[[[вставить пункты с тегами </w:t>
-      </w:r>
       <w:r>
         <w:rPr>
           <w:rFonts w:ascii="Times New Roman" w:hAnsi="Times New Roman" w:eastAsia="Times New Roman"/>
           <w:b/>
           <w:color w:val="965A00"/>
-          <w:sz w:val="20"/>
+          <w:sz w:val="24"/>
           <w:highlight w:val="yellow"/>
         </w:rPr>
         <w:t>[{[ПЕРЕД-06]}]</w:t>
@@ -701,14 +1109,20 @@
           <w:rFonts w:ascii="Times New Roman" w:hAnsi="Times New Roman" w:eastAsia="Times New Roman"/>
           <w:sz w:val="24"/>
         </w:rPr>
-        <w:t xml:space="preserve"> - </w:t>
+        <w:t xml:space="preserve"> 2.6. Обо всех обнаруженных неисправностях оборудования, инвентаря, электропроводки и других неполадках сообщить непосредственному руководителю и приступить к работе только после их устранения.</w:t>
       </w:r>
+    </w:p>
+    <w:p>
+      <w:pPr>
+        <w:widowControl/>
+        <w:spacing w:after="60"/>
+      </w:pPr>
       <w:r>
         <w:rPr>
           <w:rFonts w:ascii="Times New Roman" w:hAnsi="Times New Roman" w:eastAsia="Times New Roman"/>
           <w:b/>
           <w:color w:val="965A00"/>
-          <w:sz w:val="20"/>
+          <w:sz w:val="24"/>
           <w:highlight w:val="yellow"/>
         </w:rPr>
         <w:t>[{[ПЕРЕД-07]}]</w:t>
@@ -718,7 +1132,7 @@
           <w:rFonts w:ascii="Times New Roman" w:hAnsi="Times New Roman" w:eastAsia="Times New Roman"/>
           <w:sz w:val="24"/>
         </w:rPr>
-        <w:t xml:space="preserve"> из ИОТ-СПС-01]]]</w:t>
+        <w:t xml:space="preserve"> 2.7. Работник не должен приступать к работе, если:</w:t>
       </w:r>
     </w:p>
     <w:p>
@@ -968,20 +1382,14 @@
     <w:p>
       <w:pPr>
         <w:widowControl/>
+        <w:spacing w:after="60"/>
       </w:pPr>
-      <w:r>
-        <w:rPr>
-          <w:rFonts w:ascii="Times New Roman" w:hAnsi="Times New Roman" w:eastAsia="Times New Roman"/>
-          <w:sz w:val="24"/>
-        </w:rPr>
-        <w:t xml:space="preserve">[[[вставить пункты с тегами </w:t>
-      </w:r>
       <w:r>
         <w:rPr>
           <w:rFonts w:ascii="Times New Roman" w:hAnsi="Times New Roman" w:eastAsia="Times New Roman"/>
           <w:b/>
           <w:color w:val="965A00"/>
-          <w:sz w:val="20"/>
+          <w:sz w:val="24"/>
           <w:highlight w:val="yellow"/>
         </w:rPr>
         <w:t>[{[ВОВРЕМЯ-09]}]</w:t>
@@ -991,14 +1399,20 @@
           <w:rFonts w:ascii="Times New Roman" w:hAnsi="Times New Roman" w:eastAsia="Times New Roman"/>
           <w:sz w:val="24"/>
         </w:rPr>
-        <w:t xml:space="preserve"> - </w:t>
+        <w:t xml:space="preserve"> 3.9. При ухудшении состояния здоровья, в том числе при проявлении признаков острого профессионального заболевания (отравления), немедленно известить непосредственного или вышестоящего руководителя, обратиться за медицинской помощью.</w:t>
       </w:r>
+    </w:p>
+    <w:p>
+      <w:pPr>
+        <w:widowControl/>
+        <w:spacing w:after="60"/>
+      </w:pPr>
       <w:r>
         <w:rPr>
           <w:rFonts w:ascii="Times New Roman" w:hAnsi="Times New Roman" w:eastAsia="Times New Roman"/>
           <w:b/>
           <w:color w:val="965A00"/>
-          <w:sz w:val="20"/>
+          <w:sz w:val="24"/>
           <w:highlight w:val="yellow"/>
         </w:rPr>
         <w:t>[{[ВОВРЕМЯ-10]}]</w:t>
@@ -1008,7 +1422,7 @@
           <w:rFonts w:ascii="Times New Roman" w:hAnsi="Times New Roman" w:eastAsia="Times New Roman"/>
           <w:sz w:val="24"/>
         </w:rPr>
-        <w:t xml:space="preserve"> из ИОТ-СПС-01]]]</w:t>
+        <w:t xml:space="preserve"> 3.10. Если в процессе работы станет непонятно, как выполнить порученную работу, или в случае отсутствия необходимых приспособлений – обратиться к непосредственному руководителю. По окончании выполнения задания доложить об этом руководителю.</w:t>
       </w:r>
     </w:p>
     <w:p>
@@ -1027,20 +1441,14 @@
     <w:p>
       <w:pPr>
         <w:widowControl/>
+        <w:spacing w:after="60"/>
       </w:pPr>
-      <w:r>
-        <w:rPr>
-          <w:rFonts w:ascii="Times New Roman" w:hAnsi="Times New Roman" w:eastAsia="Times New Roman"/>
-          <w:sz w:val="24"/>
-        </w:rPr>
-        <w:t xml:space="preserve">[[[вставить пункты с тегами </w:t>
-      </w:r>
       <w:r>
         <w:rPr>
           <w:rFonts w:ascii="Times New Roman" w:hAnsi="Times New Roman" w:eastAsia="Times New Roman"/>
           <w:b/>
           <w:color w:val="965A00"/>
-          <w:sz w:val="20"/>
+          <w:sz w:val="24"/>
           <w:highlight w:val="yellow"/>
         </w:rPr>
         <w:t>[{[АВАР-01]}]</w:t>
@@ -1050,14 +1458,135 @@
           <w:rFonts w:ascii="Times New Roman" w:hAnsi="Times New Roman" w:eastAsia="Times New Roman"/>
           <w:sz w:val="24"/>
         </w:rPr>
-        <w:t xml:space="preserve"> - </w:t>
+        <w:t xml:space="preserve"> 4.1. При выполнении работ возможно возникновение следующих аварийных ситуаций:</w:t>
       </w:r>
+    </w:p>
+    <w:p>
+      <w:pPr>
+        <w:widowControl/>
+        <w:spacing w:after="60"/>
+      </w:pPr>
       <w:r>
         <w:rPr>
           <w:rFonts w:ascii="Times New Roman" w:hAnsi="Times New Roman" w:eastAsia="Times New Roman"/>
           <w:b/>
           <w:color w:val="965A00"/>
-          <w:sz w:val="20"/>
+          <w:sz w:val="24"/>
+          <w:highlight w:val="yellow"/>
+        </w:rPr>
+        <w:t>[{[АВАР-02]}]</w:t>
+      </w:r>
+      <w:r>
+        <w:rPr>
+          <w:rFonts w:ascii="Times New Roman" w:hAnsi="Times New Roman" w:eastAsia="Times New Roman"/>
+          <w:sz w:val="24"/>
+        </w:rPr>
+        <w:t xml:space="preserve"> 4.2. В случае обнаружения неисправности, нарушающей нормальный режим работы, немедленно прекратить работу. Обо всех замеченных недостатках поставить в известность непосредственного руководителя.</w:t>
+      </w:r>
+    </w:p>
+    <w:p>
+      <w:pPr>
+        <w:widowControl/>
+        <w:spacing w:after="60"/>
+      </w:pPr>
+      <w:r>
+        <w:rPr>
+          <w:rFonts w:ascii="Times New Roman" w:hAnsi="Times New Roman" w:eastAsia="Times New Roman"/>
+          <w:b/>
+          <w:color w:val="965A00"/>
+          <w:sz w:val="24"/>
+          <w:highlight w:val="yellow"/>
+        </w:rPr>
+        <w:t>[{[АВАР-03]}]</w:t>
+      </w:r>
+      <w:r>
+        <w:rPr>
+          <w:rFonts w:ascii="Times New Roman" w:hAnsi="Times New Roman" w:eastAsia="Times New Roman"/>
+          <w:sz w:val="24"/>
+        </w:rPr>
+        <w:t xml:space="preserve"> 4.3. При несчастном случае необходимо:</w:t>
+      </w:r>
+    </w:p>
+    <w:p>
+      <w:pPr>
+        <w:widowControl/>
+        <w:spacing w:after="60"/>
+      </w:pPr>
+      <w:r>
+        <w:rPr>
+          <w:rFonts w:ascii="Times New Roman" w:hAnsi="Times New Roman" w:eastAsia="Times New Roman"/>
+          <w:b/>
+          <w:color w:val="965A00"/>
+          <w:sz w:val="24"/>
+          <w:highlight w:val="yellow"/>
+        </w:rPr>
+        <w:t>[{[АВАР-04]}]</w:t>
+      </w:r>
+      <w:r>
+        <w:rPr>
+          <w:rFonts w:ascii="Times New Roman" w:hAnsi="Times New Roman" w:eastAsia="Times New Roman"/>
+          <w:sz w:val="24"/>
+        </w:rPr>
+        <w:t xml:space="preserve"> 4.4. При обнаружении запаха газа или прорыве трубопроводов (водоснабжения, канализации, отопления и др.) вызвать по телефону соответствующую специализированную аварийную бригаду. Для обеспечения безопасности оградить опасное место и установить предупреждающие знаки.</w:t>
+      </w:r>
+    </w:p>
+    <w:p>
+      <w:pPr>
+        <w:widowControl/>
+        <w:spacing w:after="60"/>
+      </w:pPr>
+      <w:r>
+        <w:rPr>
+          <w:rFonts w:ascii="Times New Roman" w:hAnsi="Times New Roman" w:eastAsia="Times New Roman"/>
+          <w:b/>
+          <w:color w:val="965A00"/>
+          <w:sz w:val="24"/>
+          <w:highlight w:val="yellow"/>
+        </w:rPr>
+        <w:t>[{[АВАР-05]}]</w:t>
+      </w:r>
+      <w:r>
+        <w:rPr>
+          <w:rFonts w:ascii="Times New Roman" w:hAnsi="Times New Roman" w:eastAsia="Times New Roman"/>
+          <w:sz w:val="24"/>
+        </w:rPr>
+        <w:t xml:space="preserve"> 4.5. При возникновении пожара:</w:t>
+      </w:r>
+    </w:p>
+    <w:p>
+      <w:pPr>
+        <w:widowControl/>
+        <w:spacing w:after="60"/>
+      </w:pPr>
+      <w:r>
+        <w:rPr>
+          <w:rFonts w:ascii="Times New Roman" w:hAnsi="Times New Roman" w:eastAsia="Times New Roman"/>
+          <w:b/>
+          <w:color w:val="965A00"/>
+          <w:sz w:val="24"/>
+          <w:highlight w:val="yellow"/>
+        </w:rPr>
+        <w:t>[{[АВАР-06]}]</w:t>
+      </w:r>
+      <w:r>
+        <w:rPr>
+          <w:rFonts w:ascii="Times New Roman" w:hAnsi="Times New Roman" w:eastAsia="Times New Roman"/>
+          <w:sz w:val="24"/>
+        </w:rPr>
+        <w:t xml:space="preserve"> 4.6. Первая помощь пострадавшим:</w:t>
+      </w:r>
+    </w:p>
+    <w:p>
+      <w:pPr>
+        <w:widowControl/>
+        <w:spacing w:after="60"/>
+      </w:pPr>
+      <w:r>
+        <w:rPr>
+          <w:rFonts w:ascii="Times New Roman" w:hAnsi="Times New Roman" w:eastAsia="Times New Roman"/>
+          <w:b/>
+          <w:color w:val="965A00"/>
+          <w:sz w:val="24"/>
           <w:highlight w:val="yellow"/>
         </w:rPr>
         <w:t>[{[АВАР-07]}]</w:t>
@@ -1067,7 +1596,7 @@
           <w:rFonts w:ascii="Times New Roman" w:hAnsi="Times New Roman" w:eastAsia="Times New Roman"/>
           <w:sz w:val="24"/>
         </w:rPr>
-        <w:t xml:space="preserve"> из ИОТ-СПС-01]]]</w:t>
+        <w:t xml:space="preserve"> 4.7. Пострадавшему при травмировании, отравлении и внезапном заболевании должна быть оказана первая помощь и, при необходимости, организована его доставка в учреждение здравоохранения.</w:t>
       </w:r>
     </w:p>
     <w:p>
@@ -1192,20 +1721,14 @@
     <w:p>
       <w:pPr>
         <w:widowControl/>
+        <w:spacing w:after="60"/>
       </w:pPr>
-      <w:r>
-        <w:rPr>
-          <w:rFonts w:ascii="Times New Roman" w:hAnsi="Times New Roman" w:eastAsia="Times New Roman"/>
-          <w:sz w:val="24"/>
-        </w:rPr>
-        <w:t xml:space="preserve">[[[вставить пункты с тегами </w:t>
-      </w:r>
       <w:r>
         <w:rPr>
           <w:rFonts w:ascii="Times New Roman" w:hAnsi="Times New Roman" w:eastAsia="Times New Roman"/>
           <w:b/>
           <w:color w:val="965A00"/>
-          <w:sz w:val="20"/>
+          <w:sz w:val="24"/>
           <w:highlight w:val="yellow"/>
         </w:rPr>
         <w:t>[{[ОКОНЧ-02]}]</w:t>
@@ -1215,14 +1738,89 @@
           <w:rFonts w:ascii="Times New Roman" w:hAnsi="Times New Roman" w:eastAsia="Times New Roman"/>
           <w:sz w:val="24"/>
         </w:rPr>
-        <w:t xml:space="preserve"> - </w:t>
+        <w:t xml:space="preserve"> 5.2. Привести в порядок рабочее место. Собрать и вынести в установленное место мусор, производственные отходы.</w:t>
       </w:r>
+    </w:p>
+    <w:p>
+      <w:pPr>
+        <w:widowControl/>
+        <w:spacing w:after="60"/>
+      </w:pPr>
       <w:r>
         <w:rPr>
           <w:rFonts w:ascii="Times New Roman" w:hAnsi="Times New Roman" w:eastAsia="Times New Roman"/>
           <w:b/>
           <w:color w:val="965A00"/>
-          <w:sz w:val="20"/>
+          <w:sz w:val="24"/>
+          <w:highlight w:val="yellow"/>
+        </w:rPr>
+        <w:t>[{[ОКОНЧ-03]}]</w:t>
+      </w:r>
+      <w:r>
+        <w:rPr>
+          <w:rFonts w:ascii="Times New Roman" w:hAnsi="Times New Roman" w:eastAsia="Times New Roman"/>
+          <w:sz w:val="24"/>
+        </w:rPr>
+        <w:t xml:space="preserve"> 5.3. Снять СИЗ, спецодежду, спецобувь, осмотреть и убедиться в их исправности, убрать в индивидуальный шкаф или иное предназначенное для них место. Не допускается хранение спецодежды на рабочем месте.</w:t>
+      </w:r>
+    </w:p>
+    <w:p>
+      <w:pPr>
+        <w:widowControl/>
+        <w:spacing w:after="60"/>
+      </w:pPr>
+      <w:r>
+        <w:rPr>
+          <w:rFonts w:ascii="Times New Roman" w:hAnsi="Times New Roman" w:eastAsia="Times New Roman"/>
+          <w:b/>
+          <w:color w:val="965A00"/>
+          <w:sz w:val="24"/>
+          <w:highlight w:val="yellow"/>
+        </w:rPr>
+        <w:t>[{[ОКОНЧ-04]}]</w:t>
+      </w:r>
+      <w:r>
+        <w:rPr>
+          <w:rFonts w:ascii="Times New Roman" w:hAnsi="Times New Roman" w:eastAsia="Times New Roman"/>
+          <w:sz w:val="24"/>
+        </w:rPr>
+        <w:t xml:space="preserve"> 5.4. Вымыть руки тёплой водой с мылом, при необходимости принять душ.</w:t>
+      </w:r>
+    </w:p>
+    <w:p>
+      <w:pPr>
+        <w:widowControl/>
+        <w:spacing w:after="60"/>
+      </w:pPr>
+      <w:r>
+        <w:rPr>
+          <w:rFonts w:ascii="Times New Roman" w:hAnsi="Times New Roman" w:eastAsia="Times New Roman"/>
+          <w:b/>
+          <w:color w:val="965A00"/>
+          <w:sz w:val="24"/>
+          <w:highlight w:val="yellow"/>
+        </w:rPr>
+        <w:t>[{[ОКОНЧ-05]}]</w:t>
+      </w:r>
+      <w:r>
+        <w:rPr>
+          <w:rFonts w:ascii="Times New Roman" w:hAnsi="Times New Roman" w:eastAsia="Times New Roman"/>
+          <w:sz w:val="24"/>
+        </w:rPr>
+        <w:t xml:space="preserve"> 5.5. Об окончании работы и всех недостатках, обнаруженных во время работы, известить непосредственного руководителя.</w:t>
+      </w:r>
+    </w:p>
+    <w:p>
+      <w:pPr>
+        <w:widowControl/>
+        <w:spacing w:after="60"/>
+      </w:pPr>
+      <w:r>
+        <w:rPr>
+          <w:rFonts w:ascii="Times New Roman" w:hAnsi="Times New Roman" w:eastAsia="Times New Roman"/>
+          <w:b/>
+          <w:color w:val="965A00"/>
+          <w:sz w:val="24"/>
           <w:highlight w:val="yellow"/>
         </w:rPr>
         <w:t>[{[ОКОНЧ-06]}]</w:t>
@@ -1232,7 +1830,7 @@
           <w:rFonts w:ascii="Times New Roman" w:hAnsi="Times New Roman" w:eastAsia="Times New Roman"/>
           <w:sz w:val="24"/>
         </w:rPr>
-        <w:t xml:space="preserve"> из ИОТ-СПС-01]]]</w:t>
+        <w:t xml:space="preserve"> 5.6. По окончании работ по наряду-допуску закрыть наряд-допуск.</w:t>
       </w:r>
     </w:p>
     <w:p>

</xml_diff>